<commit_message>
add ba and more
</commit_message>
<xml_diff>
--- a/app/templates/TEMPLATE_SD_STDBY.docx
+++ b/app/templates/TEMPLATE_SD_STDBY.docx
@@ -889,7 +889,25 @@
           <w:szCs w:val="20"/>
           <w:u w:val="single"/>
         </w:rPr>
-        <w:t>${name}</w:t>
+        <w:t>${</w:t>
+      </w:r>
+      <w:r>
+        <w:rPr>
+          <w:rFonts w:ascii="Arial" w:eastAsia="Calibri" w:hAnsi="Arial" w:cs="Arial"/>
+          <w:sz w:val="20"/>
+          <w:szCs w:val="20"/>
+          <w:u w:val="single"/>
+        </w:rPr>
+        <w:t>pic_</w:t>
+      </w:r>
+      <w:r>
+        <w:rPr>
+          <w:rFonts w:ascii="Arial" w:eastAsia="Calibri" w:hAnsi="Arial" w:cs="Arial"/>
+          <w:sz w:val="20"/>
+          <w:szCs w:val="20"/>
+          <w:u w:val="single"/>
+        </w:rPr>
+        <w:t>name}</w:t>
       </w:r>
       <w:r>
         <w:rPr>
@@ -938,7 +956,25 @@
           <w:sz w:val="20"/>
           <w:szCs w:val="20"/>
         </w:rPr>
-        <w:t>${department}</w:t>
+        <w:t>${</w:t>
+      </w:r>
+      <w:r>
+        <w:rPr>
+          <w:rFonts w:ascii="Arial" w:eastAsia="Calibri" w:hAnsi="Arial" w:cs="Arial"/>
+          <w:b/>
+          <w:sz w:val="20"/>
+          <w:szCs w:val="20"/>
+        </w:rPr>
+        <w:t>pic_</w:t>
+      </w:r>
+      <w:r>
+        <w:rPr>
+          <w:rFonts w:ascii="Arial" w:eastAsia="Calibri" w:hAnsi="Arial" w:cs="Arial"/>
+          <w:b/>
+          <w:sz w:val="20"/>
+          <w:szCs w:val="20"/>
+        </w:rPr>
+        <w:t>department}</w:t>
       </w:r>
       <w:r>
         <w:rPr>

</xml_diff>